<commit_message>
Release Units 2–9 curriculum upgrades with Reveal documents
</commit_message>
<xml_diff>
--- a/lessons/2-1/downloads/2-1-notes-l1.docx
+++ b/lessons/2-1/downloads/2-1-notes-l1.docx
@@ -544,7 +544,7 @@
                 <w:sz w:val="21"/>
                 <w:szCs w:val="21"/>
               </w:rPr>
-              <w:t xml:space="preserve">A question where the answers will be different for different people.</w:t>
+              <w:t xml:space="preserve">A question answered with data that are expected to vary.</w:t>
             </w:r>
           </w:p>
           <w:p>
@@ -698,7 +698,7 @@
                 <w:sz w:val="21"/>
                 <w:szCs w:val="21"/>
               </w:rPr>
-              <w:t xml:space="preserve">A question that has just one fixed answer that is the same no matter who you ask, so there is no data to collect.</w:t>
+              <w:t xml:space="preserve">A question that does not anticipate variability in the data used to answer it. It may ask for one fact or measurement.</w:t>
             </w:r>
           </w:p>
           <w:p>
@@ -1339,7 +1339,7 @@
                 <w:sz w:val="18"/>
                 <w:szCs w:val="18"/>
               </w:rPr>
-              <w:t xml:space="preserve">If most scores cluster in the middle with fewer at the edges, the distribution is symmetric</w:t>
+              <w:t xml:space="preserve">A distribution is symmetric when its left and right sides have approximately matching shapes around the center.</w:t>
             </w:r>
           </w:p>
         </w:tc>
@@ -1709,7 +1709,7 @@
           <w:sz w:val="22"/>
           <w:szCs w:val="22"/>
         </w:rPr>
-        <w:t xml:space="preserve">A question that has one fixed answer and does not need data collection is a </w:t>
+        <w:t xml:space="preserve">A question that does not anticipate variability in the data is a </w:t>
       </w:r>
       <w:r>
         <w:rPr>

</xml_diff>